<commit_message>
EXERCISE 3: Part 3 finished and optimized parts 1 and 2
</commit_message>
<xml_diff>
--- a/exercise_3/harjoite_3_raportti.docx
+++ b/exercise_3/harjoite_3_raportti.docx
@@ -10,11 +10,7 @@
       </w:pPr>
       <w:r>
         <w:rPr/>
-        <w:t xml:space="preserve">Harjoitus </w:t>
-      </w:r>
-      <w:r>
-        <w:rPr/>
-        <w:t>3</w:t>
+        <w:t>Harjoitus 3</w:t>
       </w:r>
     </w:p>
     <w:p>
@@ -117,7 +113,7 @@
       </w:pPr>
       <w:r>
         <w:rPr/>
-        <w:t>Aloitin työn selvittämällä Youtubesta Arduinon kytkentöjä. Tämän selvitettyäni sain alla olevan kuvan mukaisen kytkennän Tinkercadissa, jonka testasin toimivaksi. Tämä tulee ilmi paremmin myöhemmin tehtäväkohtaisissa raporteissa. Tässä tapauksessa meillä on koekytkentälevy kytkentöjä varten ja Arduinu Uno R3, mikrokontrolleri. GND ja 5V pinnit tällä levyllä tuovat järjestelmän käyttöön virran. 5V on koekytkentälevyssä plus-rivillä, kun taas GND minus-rivillä. Näiden molempien kytkentöjen on oltava näillä paikoillaan, jotta sähkö kulkee Arduino-järjestelmän ja koekytkentälevyn välillä.</w:t>
+        <w:t>Toteutin kytkennän tehtävänannon mukaisesti yksi yhteen jokaisen kytkennän. Aluksi, aloittaessani tehtävää 1 havaitsin, että vihreä led-valo, joka kuuluu tehtävään, ei syttynyt mitenkään palamaan. Tutkittuani kytkennät oikein ja että edes painikkeet toimivat havaitsin, että led-valo oli asetettu väärinpäin. Käännettyäni sen niin, että suora pinni on oikealla samalla tasolla kytkentään, joka on minus-navassa, tämä otti valoa, ja käyrä pinni on resistoriin yhteydessä.</w:t>
       </w:r>
     </w:p>
     <w:p>
@@ -127,18 +123,8 @@
         <w:rPr/>
       </w:pPr>
       <w:r>
-        <w:rPr/>
-      </w:r>
-    </w:p>
-    <w:p>
-      <w:pPr>
-        <w:pStyle w:val="Normal"/>
-        <w:ind w:hanging="0"/>
-        <w:rPr/>
-      </w:pPr>
-      <w:r>
         <w:drawing>
-          <wp:anchor behindDoc="0" distT="0" distB="0" distL="0" distR="0" simplePos="0" locked="0" layoutInCell="0" allowOverlap="1" relativeHeight="2">
+          <wp:anchor behindDoc="0" distT="0" distB="0" distL="0" distR="0" simplePos="0" locked="0" layoutInCell="0" allowOverlap="1" relativeHeight="6">
             <wp:simplePos x="0" y="0"/>
             <wp:positionH relativeFrom="column">
               <wp:align>center</wp:align>
@@ -186,7 +172,15 @@
       </w:r>
       <w:r>
         <w:rPr/>
-        <w:t>Kuva 1. Harjoitustehtävää 2 varten toteutettu kytkentäkaavio Tinkercad-ohjelmassa.</w:t>
+        <w:t xml:space="preserve">Kuva 1. Harjoitustehtävää </w:t>
+      </w:r>
+      <w:r>
+        <w:rPr/>
+        <w:t>3</w:t>
+      </w:r>
+      <w:r>
+        <w:rPr/>
+        <w:t xml:space="preserve"> varten toteutettu kytkentäkaavio Tinkercad-ohjelmassa.</w:t>
       </w:r>
     </w:p>
     <w:p>
@@ -201,13 +195,40 @@
     </w:p>
     <w:p>
       <w:pPr>
+        <w:pStyle w:val="Heading1"/>
+        <w:pBdr/>
+        <w:spacing w:before="0" w:after="560"/>
+        <w:ind w:hanging="567" w:left="567"/>
+        <w:rPr/>
+        <w:framePr w:w="2677" w:h="432" w:y="1" w:hSpace="0" w:vSpace="0" w:wrap="notBeside" w:vAnchor="text" w:hAnchor="text" w:hRule="exact"/>
+      </w:pPr>
+      <w:r>
+        <w:rPr/>
+        <w:t>Tehtävä 1</w:t>
+      </w:r>
+    </w:p>
+    <w:p>
+      <w:pPr>
         <w:pStyle w:val="Normal"/>
         <w:ind w:hanging="0"/>
         <w:rPr/>
       </w:pPr>
       <w:r>
         <w:rPr/>
-        <w:t xml:space="preserve">Tämän kuvan mukaisella kytkennällä koodiin generoitui automaattisesti </w:t>
+        <w:t xml:space="preserve">Toteutuksessa ei käytetty muita funktioita tai skriptissä itsessään määriteltyjä muuttujia, ainoastaan </w:t>
+      </w:r>
+      <w:r>
+        <w:rPr>
+          <w:i/>
+          <w:iCs/>
+          <w:sz w:val="22"/>
+          <w:szCs w:val="22"/>
+        </w:rPr>
+        <w:t>setup</w:t>
+      </w:r>
+      <w:r>
+        <w:rPr/>
+        <w:t xml:space="preserve">- ja </w:t>
       </w:r>
       <w:r>
         <w:rPr>
@@ -220,7 +241,35 @@
       </w:r>
       <w:r>
         <w:rPr/>
-        <w:t xml:space="preserve"> ja </w:t>
+        <w:t xml:space="preserve">-funktioita. </w:t>
+      </w:r>
+      <w:r>
+        <w:rPr/>
+        <w:t xml:space="preserve">Tässä tuli ongelma ledin syttymisessä, mikä on mainittu kappaleessa </w:t>
+      </w:r>
+      <w:r>
+        <w:rPr>
+          <w:b/>
+          <w:bCs/>
+          <w:i/>
+          <w:iCs/>
+        </w:rPr>
+        <w:t>Kytkentä ja aloitus</w:t>
+      </w:r>
+      <w:r>
+        <w:rPr/>
+        <w:t>.</w:t>
+      </w:r>
+    </w:p>
+    <w:p>
+      <w:pPr>
+        <w:pStyle w:val="Normal"/>
+        <w:ind w:hanging="0"/>
+        <w:rPr/>
+      </w:pPr>
+      <w:r>
+        <w:rPr/>
+        <w:t xml:space="preserve">Asetin </w:t>
       </w:r>
       <w:r>
         <w:rPr>
@@ -233,7 +282,20 @@
       </w:r>
       <w:r>
         <w:rPr/>
-        <w:t xml:space="preserve"> -funktiot. Nämä funktiot ovat Arduino-ohjelmistoissa välttämättömät, ja niiden on oltava koodikannassa. (Arduino Projects Book, s. 36)</w:t>
+        <w:t xml:space="preserve">-funktiossa pinneiksi 12 ja 3. 3 ottaa muodokseen inputin eli syötteen, 12 outputin. Toisin sanottuna, 3-pinni on painike, ja se on konfiguroitu </w:t>
+      </w:r>
+      <w:r>
+        <w:rPr>
+          <w:i/>
+          <w:iCs/>
+          <w:sz w:val="22"/>
+          <w:szCs w:val="22"/>
+        </w:rPr>
+        <w:t>setup</w:t>
+      </w:r>
+      <w:r>
+        <w:rPr/>
+        <w:t>-funktiossa toimimaan syötekomponenttina.</w:t>
       </w:r>
     </w:p>
     <w:p>
@@ -244,6 +306,72 @@
       </w:pPr>
       <w:r>
         <w:rPr/>
+        <w:t xml:space="preserve">Mitä tulee </w:t>
+      </w:r>
+      <w:r>
+        <w:rPr>
+          <w:i/>
+          <w:iCs/>
+          <w:sz w:val="22"/>
+          <w:szCs w:val="22"/>
+        </w:rPr>
+        <w:t>loop</w:t>
+      </w:r>
+      <w:r>
+        <w:rPr/>
+        <w:t xml:space="preserve">-funktioon, siinä on kokonaislukumuuttujaksi asetettu </w:t>
+      </w:r>
+      <w:r>
+        <w:rPr>
+          <w:i/>
+          <w:iCs/>
+          <w:sz w:val="22"/>
+          <w:szCs w:val="22"/>
+        </w:rPr>
+        <w:t>switchState</w:t>
+      </w:r>
+      <w:r>
+        <w:rPr/>
+        <w:t xml:space="preserve">, joka lukee pinnistä 3, eli painikkeesta tulevan syötteen. Tämän jälkeen on määritelty yksinkertainen ehtolauseke. Jos </w:t>
+      </w:r>
+      <w:r>
+        <w:rPr>
+          <w:i/>
+          <w:iCs/>
+          <w:sz w:val="22"/>
+          <w:szCs w:val="22"/>
+        </w:rPr>
+        <w:t>switchStaten</w:t>
+      </w:r>
+      <w:r>
+        <w:rPr/>
+        <w:t xml:space="preserve"> arvo on </w:t>
+      </w:r>
+      <w:r>
+        <w:rPr>
+          <w:i/>
+          <w:iCs/>
+          <w:sz w:val="22"/>
+          <w:szCs w:val="22"/>
+        </w:rPr>
+        <w:t>LOW</w:t>
+      </w:r>
+      <w:r>
+        <w:rPr/>
+        <w:t xml:space="preserve">, eli painiketta painitetaan, pinni 12 syttyy. Jos tämän muuttujan arvo on </w:t>
+      </w:r>
+      <w:r>
+        <w:rPr>
+          <w:i/>
+          <w:iCs/>
+          <w:sz w:val="22"/>
+          <w:szCs w:val="22"/>
+        </w:rPr>
+        <w:t>HIGH</w:t>
+      </w:r>
+      <w:r>
+        <w:rPr/>
+        <w:t>, eli painiketta ei paineta, pinni 12 sammuu.</w:t>
       </w:r>
     </w:p>
     <w:p>
@@ -254,7 +382,6 @@
       </w:pPr>
       <w:r>
         <w:rPr/>
-        <w:t>Mitä tulee tehtävissä toteutettuihin CPP-tiedostoihin, jolla ohjelmistologiikka toteutetaan, kommentointi ja dokumentointi on alan peruskäytänteiden vuoksi englanniksi. Myös pyrin tähän tehtävässä dokumentaatiossa ja kommentoinnissa noudattaa CPP:n kannalta hyviä käytänteitä, eli esimerkiksi dokumentoimaan funktioissa olevat parametrit tai argumentit.</w:t>
       </w:r>
     </w:p>
     <w:p>
@@ -268,7 +395,7 @@
       </w:pPr>
       <w:r>
         <w:rPr/>
-        <w:t>Tehtävä 1</w:t>
+        <w:t>Tehtävä 2</w:t>
       </w:r>
     </w:p>
     <w:p>
@@ -279,11 +406,244 @@
       </w:pPr>
       <w:r>
         <w:rPr/>
-        <w:t xml:space="preserve">Lorem ipsum. </w:t>
-      </w:r>
-      <w:r>
-        <w:rPr/>
-        <w:t>Led aluksi väärinpäin.</w:t>
+        <w:t xml:space="preserve">Tähän tehtävän toteutukseen otettiin käyttöön Serial, mitä käytetään Arduinon ja päätelaitteen välisessä viestinnässä. Skriptin laajuiseen käyttöön on määritelty kokonaislukumuuttuja </w:t>
+      </w:r>
+      <w:r>
+        <w:rPr>
+          <w:i/>
+          <w:iCs/>
+          <w:sz w:val="22"/>
+          <w:szCs w:val="22"/>
+        </w:rPr>
+        <w:t>index</w:t>
+      </w:r>
+      <w:r>
+        <w:rPr/>
+        <w:t>.</w:t>
+      </w:r>
+    </w:p>
+    <w:p>
+      <w:pPr>
+        <w:pStyle w:val="Normal"/>
+        <w:ind w:hanging="0"/>
+        <w:rPr/>
+      </w:pPr>
+      <w:r>
+        <w:rPr/>
+        <w:t xml:space="preserve">Olen </w:t>
+      </w:r>
+      <w:r>
+        <w:rPr>
+          <w:i/>
+          <w:iCs/>
+          <w:sz w:val="22"/>
+          <w:szCs w:val="22"/>
+        </w:rPr>
+        <w:t>setup</w:t>
+      </w:r>
+      <w:r>
+        <w:rPr/>
+        <w:t xml:space="preserve">-funktiossa vaihtanut painikkeen olemaan tehtävän annon </w:t>
+      </w:r>
+      <w:r>
+        <w:rPr/>
+        <w:t>mukainen painike</w:t>
+      </w:r>
+      <w:r>
+        <w:rPr/>
+        <w:t xml:space="preserve"> eli pinni 3. Tämän lisäksi käytössä on keskeytysfunktio </w:t>
+      </w:r>
+      <w:r>
+        <w:rPr>
+          <w:i/>
+          <w:iCs/>
+          <w:sz w:val="22"/>
+          <w:szCs w:val="22"/>
+        </w:rPr>
+        <w:t>attachInterrupt</w:t>
+      </w:r>
+      <w:r>
+        <w:rPr/>
+        <w:t xml:space="preserve">, johon olen asettanut argumenteiksi ensin </w:t>
+      </w:r>
+      <w:r>
+        <w:rPr>
+          <w:i/>
+          <w:iCs/>
+          <w:sz w:val="22"/>
+          <w:szCs w:val="22"/>
+        </w:rPr>
+        <w:t>digitalPinToInterrupt</w:t>
+      </w:r>
+      <w:r>
+        <w:rPr/>
+        <w:t xml:space="preserve">-funktiokutsun, jossa argumenttina pinni, tässä tapauksessa pinni 3, </w:t>
+      </w:r>
+      <w:r>
+        <w:rPr/>
+        <w:t>joka viittaa</w:t>
+      </w:r>
+      <w:r>
+        <w:rPr/>
+        <w:t xml:space="preserve"> painikkeeseen, seuraavana erillisen funktion </w:t>
+      </w:r>
+      <w:r>
+        <w:rPr>
+          <w:i/>
+          <w:iCs/>
+          <w:sz w:val="22"/>
+          <w:szCs w:val="22"/>
+        </w:rPr>
+        <w:t>incIdex</w:t>
+      </w:r>
+      <w:r>
+        <w:rPr/>
+        <w:t xml:space="preserve">, joka lisää </w:t>
+      </w:r>
+      <w:r>
+        <w:rPr>
+          <w:i/>
+          <w:iCs/>
+          <w:sz w:val="22"/>
+          <w:szCs w:val="22"/>
+        </w:rPr>
+        <w:t>index</w:t>
+      </w:r>
+      <w:r>
+        <w:rPr/>
+        <w:t xml:space="preserve">-muuttujan arvoa aina yhdellä ja </w:t>
+      </w:r>
+      <w:r>
+        <w:rPr>
+          <w:i/>
+          <w:iCs/>
+          <w:sz w:val="22"/>
+          <w:szCs w:val="22"/>
+        </w:rPr>
+        <w:t>CHANGE</w:t>
+      </w:r>
+      <w:r>
+        <w:rPr/>
+        <w:t xml:space="preserve">, jolla saadaan aikaan keskeyts, kun pinni muuttaa arvoaan. Toisin sanottuna, </w:t>
+      </w:r>
+      <w:r>
+        <w:rPr>
+          <w:i/>
+          <w:iCs/>
+          <w:sz w:val="22"/>
+          <w:szCs w:val="22"/>
+        </w:rPr>
+        <w:t>attachInterrupt</w:t>
+      </w:r>
+      <w:r>
+        <w:rPr/>
+        <w:t xml:space="preserve">-funktio ottaa kolme argumenttia. </w:t>
+      </w:r>
+      <w:r>
+        <w:rPr/>
+        <w:t>(Arduino Docs, 2026)</w:t>
+      </w:r>
+    </w:p>
+    <w:p>
+      <w:pPr>
+        <w:pStyle w:val="Normal"/>
+        <w:ind w:hanging="0"/>
+        <w:rPr/>
+      </w:pPr>
+      <w:r>
+        <w:rPr>
+          <w:i/>
+          <w:iCs/>
+          <w:sz w:val="22"/>
+          <w:szCs w:val="22"/>
+        </w:rPr>
+        <w:t>loop</w:t>
+      </w:r>
+      <w:r>
+        <w:rPr/>
+        <w:t>-funktiossa on ainoastaan pidetty switchState muuttuja aiemmasta toimeksiannosta ja riisuttu ehtolauseke niin, että painikkeen ollessa ylhäällä valoa ei syty pinnistä 12, eli vihreästä ledistä.</w:t>
+      </w:r>
+    </w:p>
+    <w:p>
+      <w:pPr>
+        <w:pStyle w:val="Normal"/>
+        <w:ind w:hanging="0"/>
+        <w:rPr/>
+      </w:pPr>
+      <w:r>
+        <w:rPr/>
+        <w:t xml:space="preserve">Toteutukseen on otettu erillinen funktio </w:t>
+      </w:r>
+      <w:r>
+        <w:rPr>
+          <w:i/>
+          <w:iCs/>
+          <w:sz w:val="22"/>
+          <w:szCs w:val="22"/>
+        </w:rPr>
+        <w:t>incIndex</w:t>
+      </w:r>
+      <w:r>
+        <w:rPr/>
+        <w:t xml:space="preserve"> käyttöön, jota kutsutaan keskeytysfunktiosssa. Tämä kirjoittaa indexin arvon, tässä tapauksessa englanniksi muodossa </w:t>
+      </w:r>
+      <w:r>
+        <w:rPr>
+          <w:i/>
+          <w:iCs/>
+        </w:rPr>
+        <w:t>Counter: 1</w:t>
+      </w:r>
+      <w:r>
+        <w:rPr/>
+        <w:t xml:space="preserve">, </w:t>
+      </w:r>
+      <w:r>
+        <w:rPr>
+          <w:i/>
+          <w:iCs/>
+        </w:rPr>
+        <w:t>Counter: 2</w:t>
+      </w:r>
+      <w:r>
+        <w:rPr/>
+        <w:t xml:space="preserve">, jne. rivinvaihtoineen. Kun </w:t>
+      </w:r>
+      <w:r>
+        <w:rPr>
+          <w:i/>
+          <w:iCs/>
+          <w:sz w:val="22"/>
+          <w:szCs w:val="22"/>
+        </w:rPr>
+        <w:t>incIndex</w:t>
+      </w:r>
+      <w:r>
+        <w:rPr/>
+        <w:t xml:space="preserve">-funktiota kutsutaan keskeytysfunktiossa, </w:t>
+      </w:r>
+      <w:r>
+        <w:rPr>
+          <w:i/>
+          <w:iCs/>
+          <w:sz w:val="22"/>
+          <w:szCs w:val="22"/>
+        </w:rPr>
+        <w:t>index</w:t>
+      </w:r>
+      <w:r>
+        <w:rPr/>
+        <w:t>-muuttujan arvo nousee aina yhdellä ja ledin valo syttyy palaamaan.</w:t>
+      </w:r>
+    </w:p>
+    <w:p>
+      <w:pPr>
+        <w:pStyle w:val="Normal"/>
+        <w:ind w:hanging="0"/>
+        <w:rPr/>
+      </w:pPr>
+      <w:r>
+        <w:rPr/>
       </w:r>
     </w:p>
     <w:p>
@@ -297,7 +657,7 @@
       </w:pPr>
       <w:r>
         <w:rPr/>
-        <w:t>Tehtävä 2</w:t>
+        <w:t>Tehtävä 3</w:t>
       </w:r>
     </w:p>
     <w:p>
@@ -308,21 +668,57 @@
       </w:pPr>
       <w:r>
         <w:rPr/>
-        <w:t>Lorem ipsum.</w:t>
+        <w:t>Tämän tehtävän skripti on muokattu tehtävän 2 skriptistä. Aiemmin mainittu incIndex-funktio ja sen keskeytysfunktio on jätetty tähän paikoilleen, mutta hyödynnetty toisessa käyttötapauksessa.</w:t>
       </w:r>
     </w:p>
     <w:p>
       <w:pPr>
-        <w:pStyle w:val="Heading1"/>
-        <w:pBdr/>
-        <w:spacing w:before="0" w:after="560"/>
-        <w:ind w:hanging="567" w:left="567"/>
-        <w:rPr/>
-        <w:framePr w:w="2677" w:h="432" w:y="1" w:hSpace="0" w:vSpace="0" w:wrap="notBeside" w:vAnchor="text" w:hAnchor="text" w:hRule="exact"/>
-      </w:pPr>
-      <w:r>
-        <w:rPr/>
-        <w:t>Tehtävä 3</w:t>
+        <w:pStyle w:val="Normal"/>
+        <w:ind w:hanging="0"/>
+        <w:rPr/>
+      </w:pPr>
+      <w:r>
+        <w:rPr/>
+        <w:t xml:space="preserve">Tämä on alustettu </w:t>
+      </w:r>
+      <w:r>
+        <w:rPr>
+          <w:i/>
+          <w:iCs/>
+          <w:sz w:val="22"/>
+          <w:szCs w:val="22"/>
+        </w:rPr>
+        <w:t>setup</w:t>
+      </w:r>
+      <w:r>
+        <w:rPr/>
+        <w:t xml:space="preserve">-funktiossa siten, että A0, toisin sanottuna lämpötilasensori, on kiinni Arduinon portissa A0, eli kyseessä on pinni A0. Keskeytysfunktio reagoi pinni 2:n muutoksista, toisin sanottuna se toinen painike, johon ei olla vielä koskettu. Se kutsuu toisena argumenttina funktiota </w:t>
+      </w:r>
+      <w:r>
+        <w:rPr>
+          <w:i/>
+          <w:iCs/>
+          <w:sz w:val="22"/>
+          <w:szCs w:val="22"/>
+        </w:rPr>
+        <w:t>heatValue</w:t>
+      </w:r>
+      <w:r>
+        <w:rPr/>
+        <w:t xml:space="preserve"> ja kolmas argumentti on sama </w:t>
+      </w:r>
+      <w:r>
+        <w:rPr>
+          <w:i/>
+          <w:iCs/>
+          <w:sz w:val="22"/>
+          <w:szCs w:val="22"/>
+        </w:rPr>
+        <w:t>CHANGE</w:t>
+      </w:r>
+      <w:r>
+        <w:rPr/>
+        <w:t>, kuten tehtävässä 2.</w:t>
       </w:r>
     </w:p>
     <w:p>
@@ -333,7 +729,52 @@
       </w:pPr>
       <w:r>
         <w:rPr/>
-        <w:t>Lorem ipsum.</w:t>
+        <w:t xml:space="preserve">Tässä erillisessä funktiossa on ensin reaalimuuttujana määritelty arvo summa, joka on arvoltaan 0. Tämän jälkeen on tehty silmukka, joka lisää lämpötilasensorista mitatun arvon summaan joka 20 millisekunnin välein, eli </w:t>
+      </w:r>
+      <w:r>
+        <w:rPr>
+          <w:i/>
+          <w:iCs/>
+          <w:sz w:val="22"/>
+          <w:szCs w:val="22"/>
+        </w:rPr>
+        <w:t>delay</w:t>
+      </w:r>
+      <w:r>
+        <w:rPr/>
+        <w:t xml:space="preserve">-funktio argumentilla 20. Tämän jälkeen on alustettu keskiarvoa kuvaava muuttuja </w:t>
+      </w:r>
+      <w:r>
+        <w:rPr>
+          <w:i/>
+          <w:iCs/>
+          <w:sz w:val="22"/>
+          <w:szCs w:val="22"/>
+        </w:rPr>
+        <w:t>avgADC</w:t>
+      </w:r>
+      <w:r>
+        <w:rPr/>
+        <w:t xml:space="preserve">, eli aiemmin mainittu summa jaettuna 50:llä. Tehtävänannon mukaisesti seuraavana on </w:t>
+      </w:r>
+      <w:r>
+        <w:rPr/>
+        <w:t xml:space="preserve">keskiarvoa vastaava lämpötila arvo </w:t>
+      </w:r>
+      <w:r>
+        <w:rPr>
+          <w:i/>
+          <w:iCs/>
+        </w:rPr>
+        <w:t>lt</w:t>
+      </w:r>
+      <w:r>
+        <w:rPr/>
+        <w:t xml:space="preserve">-muuttuja, </w:t>
+      </w:r>
+      <w:r>
+        <w:rPr/>
+        <w:t>joka käyttää monisteessa ensin mainittua kaavaa saadakseen oikean arvon. Lopuksi funktio tulostaa arvot Serialin kautta terminaalille. Testasin muokata lämpötilasensorin arvoa ajon aikana, ja totesin arvojen vastaavan sitä, mitä harjoituksen esimerkissä oli näytetty.</w:t>
       </w:r>
       <w:r>
         <w:br w:type="page"/>
@@ -370,15 +811,7 @@
       </w:pPr>
       <w:r>
         <w:rPr/>
-        <w:t>Arduino Projects Book. Luettu 0</w:t>
-      </w:r>
-      <w:r>
-        <w:rPr/>
-        <w:t>3</w:t>
-      </w:r>
-      <w:r>
-        <w:rPr/>
-        <w:t xml:space="preserve">.07.2026 </w:t>
+        <w:t xml:space="preserve">Arduino Projects Book. Luettu 03.07.2026 </w:t>
       </w:r>
       <w:hyperlink r:id="rId9">
         <w:r>
@@ -397,26 +830,24 @@
       </w:pPr>
       <w:r>
         <w:rPr/>
-        <w:t xml:space="preserve">Arduino Docs. digitalRead(). Viitattu 03.07.2026 </w:t>
+        <w:t xml:space="preserve">Arduino Docs. </w:t>
+      </w:r>
+      <w:r>
+        <w:rPr/>
+        <w:t>attachInterrupt().</w:t>
+      </w:r>
+      <w:r>
+        <w:rPr/>
+        <w:t xml:space="preserve"> Viitattu 05.07.2026 </w:t>
       </w:r>
       <w:hyperlink r:id="rId10">
         <w:r>
           <w:rPr>
             <w:rStyle w:val="Hyperlink"/>
           </w:rPr>
-          <w:t>https://docs.arduino.cc/language-reference/en/functions/digital-io/digitalread/</w:t>
+          <w:t>https://docs.arduino.cc/language-reference/en/functions/external-interrupts/attachInterrupt/</w:t>
         </w:r>
       </w:hyperlink>
-    </w:p>
-    <w:p>
-      <w:pPr>
-        <w:pStyle w:val="Lhde"/>
-        <w:spacing w:before="0" w:after="240"/>
-        <w:rPr/>
-      </w:pPr>
-      <w:r>
-        <w:rPr/>
-      </w:r>
     </w:p>
     <w:sectPr>
       <w:headerReference w:type="even" r:id="rId11"/>
@@ -545,7 +976,7 @@
         </w:r>
         <w:r>
           <w:rPr/>
-          <w:t>3</w:t>
+          <w:t>4</w:t>
         </w:r>
         <w:r>
           <w:rPr/>
@@ -1915,8 +2346,8 @@
       <w:sz w:val="21"/>
     </w:rPr>
   </w:style>
-  <w:style w:type="character" w:styleId="FootnoteCharactersuser">
-    <w:name w:val="Footnote Characters (user)"/>
+  <w:style w:type="character" w:styleId="FootnoteCharacters">
+    <w:name w:val="Footnote Characters"/>
     <w:uiPriority w:val="99"/>
     <w:semiHidden/>
     <w:unhideWhenUsed/>
@@ -1926,8 +2357,8 @@
       <w:vertAlign w:val="superscript"/>
     </w:rPr>
   </w:style>
-  <w:style w:type="character" w:styleId="FootnoteCharacters">
-    <w:name w:val="Footnote Characters"/>
+  <w:style w:type="character" w:styleId="FootnoteCharactersuser">
+    <w:name w:val="Footnote Characters (user)"/>
     <w:qFormat/>
     <w:rPr>
       <w:vertAlign w:val="superscript"/>
@@ -2021,17 +2452,19 @@
     <w:qFormat/>
     <w:rPr/>
   </w:style>
+  <w:style w:type="character" w:styleId="EndnoteCharactersuser">
+    <w:name w:val="Endnote Characters (user)"/>
+    <w:qFormat/>
+    <w:rPr>
+      <w:vertAlign w:val="superscript"/>
+    </w:rPr>
+  </w:style>
   <w:style w:type="character" w:styleId="EndnoteCharacters">
     <w:name w:val="Endnote Characters"/>
     <w:qFormat/>
     <w:rPr>
       <w:vertAlign w:val="superscript"/>
     </w:rPr>
-  </w:style>
-  <w:style w:type="character" w:styleId="EndnoteCharactersuser">
-    <w:name w:val="Endnote Characters (user)"/>
-    <w:qFormat/>
-    <w:rPr/>
   </w:style>
   <w:style w:type="character" w:styleId="EndnoteReference">
     <w:name w:val="endnote reference"/>
@@ -2583,22 +3016,22 @@
     <w:pPr/>
     <w:rPr/>
   </w:style>
+  <w:style w:type="paragraph" w:styleId="FrameContents">
+    <w:name w:val="Frame Contents"/>
+    <w:basedOn w:val="Normal"/>
+    <w:qFormat/>
+    <w:pPr/>
+    <w:rPr/>
+  </w:style>
+  <w:style w:type="paragraph" w:styleId="HeaderLeft">
+    <w:name w:val="Header Left"/>
+    <w:basedOn w:val="Header"/>
+    <w:qFormat/>
+    <w:pPr/>
+    <w:rPr/>
+  </w:style>
   <w:style w:type="paragraph" w:styleId="FrameContentsuser">
     <w:name w:val="Frame Contents (user)"/>
-    <w:basedOn w:val="Normal"/>
-    <w:qFormat/>
-    <w:pPr/>
-    <w:rPr/>
-  </w:style>
-  <w:style w:type="paragraph" w:styleId="HeaderLeftuser">
-    <w:name w:val="Header Left (user)"/>
-    <w:basedOn w:val="Header"/>
-    <w:qFormat/>
-    <w:pPr/>
-    <w:rPr/>
-  </w:style>
-  <w:style w:type="paragraph" w:styleId="FrameContents">
-    <w:name w:val="Frame Contents"/>
     <w:basedOn w:val="Normal"/>
     <w:qFormat/>
     <w:pPr/>

</xml_diff>